<commit_message>
Finales Dokumenten-Design auf alle fünf Dokumente ausgerollt
Leerzeile zwischen jedem Absatz und jeder Überschrift, Tight-Group-Blöcke
für zusammengehörige Hinweiszeilen und die neue Signatur, jetzt in allen
fünf Word-Dokumenten. design-vorlage.md dokumentiert diese Regel als
permanenten, projektübergreifenden Standard für künftige Dokumente.

Co-Authored-By: Claude Sonnet 5 <noreply@anthropic.com>
Claude-Session: https://claude.ai/code/session_01DeqSdBatYE6t9FA6GS9TPf
</commit_message>
<xml_diff>
--- a/vertrieb/Recognize-You-Branchenprioritaet.docx
+++ b/vertrieb/Recognize-You-Branchenprioritaet.docx
@@ -4,7 +4,7 @@
   <w:body>
     <w:p>
       <w:pPr>
-        <w:spacing w:after="100"/>
+        <w:spacing w:after="0" w:before="0"/>
       </w:pPr>
       <w:r>
         <w:rPr>
@@ -19,7 +19,20 @@
     </w:p>
     <w:p>
       <w:pPr>
-        <w:spacing w:after="110"/>
+        <w:spacing w:after="0" w:before="0"/>
+      </w:pPr>
+      <w:r>
+        <w:rPr>
+          <w:rFonts w:ascii="Calibri" w:cs="Calibri" w:eastAsia="Calibri" w:hAnsi="Calibri"/>
+          <w:sz w:val="22"/>
+          <w:szCs w:val="22"/>
+        </w:rPr>
+        <w:t xml:space="preserve"/>
+      </w:r>
+    </w:p>
+    <w:p>
+      <w:pPr>
+        <w:spacing w:after="0" w:before="0"/>
         <w:ind w:left="300"/>
       </w:pPr>
       <w:r>
@@ -37,7 +50,20 @@
     </w:p>
     <w:p>
       <w:pPr>
-        <w:spacing w:after="110" w:before="280"/>
+        <w:spacing w:after="0" w:before="0"/>
+      </w:pPr>
+      <w:r>
+        <w:rPr>
+          <w:rFonts w:ascii="Calibri" w:cs="Calibri" w:eastAsia="Calibri" w:hAnsi="Calibri"/>
+          <w:sz w:val="22"/>
+          <w:szCs w:val="22"/>
+        </w:rPr>
+        <w:t xml:space="preserve"/>
+      </w:r>
+    </w:p>
+    <w:p>
+      <w:pPr>
+        <w:spacing w:after="0" w:before="0"/>
       </w:pPr>
       <w:r>
         <w:rPr>
@@ -52,7 +78,20 @@
     </w:p>
     <w:p>
       <w:pPr>
-        <w:spacing w:after="40"/>
+        <w:spacing w:after="0" w:before="0"/>
+      </w:pPr>
+      <w:r>
+        <w:rPr>
+          <w:rFonts w:ascii="Calibri" w:cs="Calibri" w:eastAsia="Calibri" w:hAnsi="Calibri"/>
+          <w:sz w:val="22"/>
+          <w:szCs w:val="22"/>
+        </w:rPr>
+        <w:t xml:space="preserve"/>
+      </w:r>
+    </w:p>
+    <w:p>
+      <w:pPr>
+        <w:spacing w:after="0" w:before="0"/>
         <w:ind w:left="106"/>
       </w:pPr>
       <w:r>
@@ -78,7 +117,20 @@
     </w:p>
     <w:p>
       <w:pPr>
-        <w:spacing w:after="40"/>
+        <w:spacing w:after="0" w:before="0"/>
+      </w:pPr>
+      <w:r>
+        <w:rPr>
+          <w:rFonts w:ascii="Calibri" w:cs="Calibri" w:eastAsia="Calibri" w:hAnsi="Calibri"/>
+          <w:sz w:val="22"/>
+          <w:szCs w:val="22"/>
+        </w:rPr>
+        <w:t xml:space="preserve"/>
+      </w:r>
+    </w:p>
+    <w:p>
+      <w:pPr>
+        <w:spacing w:after="0" w:before="0"/>
         <w:ind w:left="106"/>
       </w:pPr>
       <w:r>
@@ -104,7 +156,20 @@
     </w:p>
     <w:p>
       <w:pPr>
-        <w:spacing w:after="40"/>
+        <w:spacing w:after="0" w:before="0"/>
+      </w:pPr>
+      <w:r>
+        <w:rPr>
+          <w:rFonts w:ascii="Calibri" w:cs="Calibri" w:eastAsia="Calibri" w:hAnsi="Calibri"/>
+          <w:sz w:val="22"/>
+          <w:szCs w:val="22"/>
+        </w:rPr>
+        <w:t xml:space="preserve"/>
+      </w:r>
+    </w:p>
+    <w:p>
+      <w:pPr>
+        <w:spacing w:after="0" w:before="0"/>
         <w:ind w:left="106"/>
       </w:pPr>
       <w:r>
@@ -130,7 +195,20 @@
     </w:p>
     <w:p>
       <w:pPr>
-        <w:spacing w:after="40"/>
+        <w:spacing w:after="0" w:before="0"/>
+      </w:pPr>
+      <w:r>
+        <w:rPr>
+          <w:rFonts w:ascii="Calibri" w:cs="Calibri" w:eastAsia="Calibri" w:hAnsi="Calibri"/>
+          <w:sz w:val="22"/>
+          <w:szCs w:val="22"/>
+        </w:rPr>
+        <w:t xml:space="preserve"/>
+      </w:r>
+    </w:p>
+    <w:p>
+      <w:pPr>
+        <w:spacing w:after="0" w:before="0"/>
         <w:ind w:left="106"/>
       </w:pPr>
       <w:r>
@@ -156,7 +234,20 @@
     </w:p>
     <w:p>
       <w:pPr>
-        <w:spacing w:after="40"/>
+        <w:spacing w:after="0" w:before="0"/>
+      </w:pPr>
+      <w:r>
+        <w:rPr>
+          <w:rFonts w:ascii="Calibri" w:cs="Calibri" w:eastAsia="Calibri" w:hAnsi="Calibri"/>
+          <w:sz w:val="22"/>
+          <w:szCs w:val="22"/>
+        </w:rPr>
+        <w:t xml:space="preserve"/>
+      </w:r>
+    </w:p>
+    <w:p>
+      <w:pPr>
+        <w:spacing w:after="0" w:before="0"/>
         <w:ind w:left="106"/>
       </w:pPr>
       <w:r>
@@ -182,7 +273,20 @@
     </w:p>
     <w:p>
       <w:pPr>
-        <w:spacing w:after="110" w:before="280"/>
+        <w:spacing w:after="0" w:before="0"/>
+      </w:pPr>
+      <w:r>
+        <w:rPr>
+          <w:rFonts w:ascii="Calibri" w:cs="Calibri" w:eastAsia="Calibri" w:hAnsi="Calibri"/>
+          <w:sz w:val="22"/>
+          <w:szCs w:val="22"/>
+        </w:rPr>
+        <w:t xml:space="preserve"/>
+      </w:r>
+    </w:p>
+    <w:p>
+      <w:pPr>
+        <w:spacing w:after="0" w:before="0"/>
       </w:pPr>
       <w:r>
         <w:rPr>
@@ -197,7 +301,20 @@
     </w:p>
     <w:p>
       <w:pPr>
-        <w:spacing w:after="40"/>
+        <w:spacing w:after="0" w:before="0"/>
+      </w:pPr>
+      <w:r>
+        <w:rPr>
+          <w:rFonts w:ascii="Calibri" w:cs="Calibri" w:eastAsia="Calibri" w:hAnsi="Calibri"/>
+          <w:sz w:val="22"/>
+          <w:szCs w:val="22"/>
+        </w:rPr>
+        <w:t xml:space="preserve"/>
+      </w:r>
+    </w:p>
+    <w:p>
+      <w:pPr>
+        <w:spacing w:after="0" w:before="0"/>
         <w:ind w:left="106"/>
       </w:pPr>
       <w:r>
@@ -235,7 +352,20 @@
     </w:p>
     <w:p>
       <w:pPr>
-        <w:spacing w:after="40"/>
+        <w:spacing w:after="0" w:before="0"/>
+      </w:pPr>
+      <w:r>
+        <w:rPr>
+          <w:rFonts w:ascii="Calibri" w:cs="Calibri" w:eastAsia="Calibri" w:hAnsi="Calibri"/>
+          <w:sz w:val="22"/>
+          <w:szCs w:val="22"/>
+        </w:rPr>
+        <w:t xml:space="preserve"/>
+      </w:r>
+    </w:p>
+    <w:p>
+      <w:pPr>
+        <w:spacing w:after="0" w:before="0"/>
         <w:ind w:left="106"/>
       </w:pPr>
       <w:r>
@@ -273,7 +403,20 @@
     </w:p>
     <w:p>
       <w:pPr>
-        <w:spacing w:after="40"/>
+        <w:spacing w:after="0" w:before="0"/>
+      </w:pPr>
+      <w:r>
+        <w:rPr>
+          <w:rFonts w:ascii="Calibri" w:cs="Calibri" w:eastAsia="Calibri" w:hAnsi="Calibri"/>
+          <w:sz w:val="22"/>
+          <w:szCs w:val="22"/>
+        </w:rPr>
+        <w:t xml:space="preserve"/>
+      </w:r>
+    </w:p>
+    <w:p>
+      <w:pPr>
+        <w:spacing w:after="0" w:before="0"/>
         <w:ind w:left="106"/>
       </w:pPr>
       <w:r>
@@ -311,7 +454,20 @@
     </w:p>
     <w:p>
       <w:pPr>
-        <w:spacing w:after="40"/>
+        <w:spacing w:after="0" w:before="0"/>
+      </w:pPr>
+      <w:r>
+        <w:rPr>
+          <w:rFonts w:ascii="Calibri" w:cs="Calibri" w:eastAsia="Calibri" w:hAnsi="Calibri"/>
+          <w:sz w:val="22"/>
+          <w:szCs w:val="22"/>
+        </w:rPr>
+        <w:t xml:space="preserve"/>
+      </w:r>
+    </w:p>
+    <w:p>
+      <w:pPr>
+        <w:spacing w:after="0" w:before="0"/>
         <w:ind w:left="106"/>
       </w:pPr>
       <w:r>
@@ -349,7 +505,20 @@
     </w:p>
     <w:p>
       <w:pPr>
-        <w:spacing w:after="40"/>
+        <w:spacing w:after="0" w:before="0"/>
+      </w:pPr>
+      <w:r>
+        <w:rPr>
+          <w:rFonts w:ascii="Calibri" w:cs="Calibri" w:eastAsia="Calibri" w:hAnsi="Calibri"/>
+          <w:sz w:val="22"/>
+          <w:szCs w:val="22"/>
+        </w:rPr>
+        <w:t xml:space="preserve"/>
+      </w:r>
+    </w:p>
+    <w:p>
+      <w:pPr>
+        <w:spacing w:after="0" w:before="0"/>
         <w:ind w:left="106"/>
       </w:pPr>
       <w:r>
@@ -387,7 +556,20 @@
     </w:p>
     <w:p>
       <w:pPr>
-        <w:spacing w:after="40"/>
+        <w:spacing w:after="0" w:before="0"/>
+      </w:pPr>
+      <w:r>
+        <w:rPr>
+          <w:rFonts w:ascii="Calibri" w:cs="Calibri" w:eastAsia="Calibri" w:hAnsi="Calibri"/>
+          <w:sz w:val="22"/>
+          <w:szCs w:val="22"/>
+        </w:rPr>
+        <w:t xml:space="preserve"/>
+      </w:r>
+    </w:p>
+    <w:p>
+      <w:pPr>
+        <w:spacing w:after="0" w:before="0"/>
         <w:ind w:left="106"/>
       </w:pPr>
       <w:r>
@@ -425,7 +607,20 @@
     </w:p>
     <w:p>
       <w:pPr>
-        <w:spacing w:after="40"/>
+        <w:spacing w:after="0" w:before="0"/>
+      </w:pPr>
+      <w:r>
+        <w:rPr>
+          <w:rFonts w:ascii="Calibri" w:cs="Calibri" w:eastAsia="Calibri" w:hAnsi="Calibri"/>
+          <w:sz w:val="22"/>
+          <w:szCs w:val="22"/>
+        </w:rPr>
+        <w:t xml:space="preserve"/>
+      </w:r>
+    </w:p>
+    <w:p>
+      <w:pPr>
+        <w:spacing w:after="0" w:before="0"/>
         <w:ind w:left="106"/>
       </w:pPr>
       <w:r>
@@ -463,7 +658,20 @@
     </w:p>
     <w:p>
       <w:pPr>
-        <w:spacing w:after="40"/>
+        <w:spacing w:after="0" w:before="0"/>
+      </w:pPr>
+      <w:r>
+        <w:rPr>
+          <w:rFonts w:ascii="Calibri" w:cs="Calibri" w:eastAsia="Calibri" w:hAnsi="Calibri"/>
+          <w:sz w:val="22"/>
+          <w:szCs w:val="22"/>
+        </w:rPr>
+        <w:t xml:space="preserve"/>
+      </w:r>
+    </w:p>
+    <w:p>
+      <w:pPr>
+        <w:spacing w:after="0" w:before="0"/>
         <w:ind w:left="106"/>
       </w:pPr>
       <w:r>
@@ -501,7 +709,20 @@
     </w:p>
     <w:p>
       <w:pPr>
-        <w:spacing w:after="110" w:before="280"/>
+        <w:spacing w:after="0" w:before="0"/>
+      </w:pPr>
+      <w:r>
+        <w:rPr>
+          <w:rFonts w:ascii="Calibri" w:cs="Calibri" w:eastAsia="Calibri" w:hAnsi="Calibri"/>
+          <w:sz w:val="22"/>
+          <w:szCs w:val="22"/>
+        </w:rPr>
+        <w:t xml:space="preserve"/>
+      </w:r>
+    </w:p>
+    <w:p>
+      <w:pPr>
+        <w:spacing w:after="0" w:before="0"/>
       </w:pPr>
       <w:r>
         <w:rPr>
@@ -516,7 +737,20 @@
     </w:p>
     <w:p>
       <w:pPr>
-        <w:spacing w:after="200"/>
+        <w:spacing w:after="0" w:before="0"/>
+      </w:pPr>
+      <w:r>
+        <w:rPr>
+          <w:rFonts w:ascii="Calibri" w:cs="Calibri" w:eastAsia="Calibri" w:hAnsi="Calibri"/>
+          <w:sz w:val="22"/>
+          <w:szCs w:val="22"/>
+        </w:rPr>
+        <w:t xml:space="preserve"/>
+      </w:r>
+    </w:p>
+    <w:p>
+      <w:pPr>
+        <w:spacing w:after="0" w:before="0"/>
       </w:pPr>
       <w:r>
         <w:rPr>

</xml_diff>